<commit_message>
Ajout des cartes de la planète 4
</commit_message>
<xml_diff>
--- a/Planete_4.docx
+++ b/Planete_4.docx
@@ -1,6 +1,6 @@
 
 <file path=word/document.xml><?xml version="1.0" encoding="utf-8"?>
-<w:document xmlns:wpc="http://schemas.microsoft.com/office/word/2010/wordprocessingCanvas" xmlns:cx="http://schemas.microsoft.com/office/drawing/2014/chartex" xmlns:cx1="http://schemas.microsoft.com/office/drawing/2015/9/8/chartex" xmlns:cx2="http://schemas.microsoft.com/office/drawing/2015/10/21/chartex" xmlns:cx3="http://schemas.microsoft.com/office/drawing/2016/5/9/chartex" xmlns:cx4="http://schemas.microsoft.com/office/drawing/2016/5/10/chartex" xmlns:cx5="http://schemas.microsoft.com/office/drawing/2016/5/11/chartex" xmlns:cx6="http://schemas.microsoft.com/office/drawing/2016/5/12/chartex" xmlns:cx7="http://schemas.microsoft.com/office/drawing/2016/5/13/chartex" xmlns:cx8="http://schemas.microsoft.com/office/drawing/2016/5/14/chartex" xmlns:mc="http://schemas.openxmlformats.org/markup-compatibility/2006" xmlns:aink="http://schemas.microsoft.com/office/drawing/2016/ink" xmlns:am3d="http://schemas.microsoft.com/office/drawing/2017/model3d" xmlns:o="urn:schemas-microsoft-com:office:office" xmlns:r="http://schemas.openxmlformats.org/officeDocument/2006/relationships" xmlns:m="http://schemas.openxmlformats.org/officeDocument/2006/math" xmlns:v="urn:schemas-microsoft-com:vml" xmlns:wp14="http://schemas.microsoft.com/office/word/2010/wordprocessingDrawing" xmlns:wp="http://schemas.openxmlformats.org/drawingml/2006/wordprocessingDrawing" xmlns:w10="urn:schemas-microsoft-com:office:word" xmlns:w="http://schemas.openxmlformats.org/wordprocessingml/2006/main" xmlns:w14="http://schemas.microsoft.com/office/word/2010/wordml" xmlns:w15="http://schemas.microsoft.com/office/word/2012/wordml" xmlns:w16cex="http://schemas.microsoft.com/office/word/2018/wordml/cex" xmlns:w16cid="http://schemas.microsoft.com/office/word/2016/wordml/cid" xmlns:w16="http://schemas.microsoft.com/office/word/2018/wordml" xmlns:w16sdtdh="http://schemas.microsoft.com/office/word/2020/wordml/sdtdatahash" xmlns:w16se="http://schemas.microsoft.com/office/word/2015/wordml/symex" xmlns:wpg="http://schemas.microsoft.com/office/word/2010/wordprocessingGroup" xmlns:wpi="http://schemas.microsoft.com/office/word/2010/wordprocessingInk" xmlns:wne="http://schemas.microsoft.com/office/word/2006/wordml" xmlns:wps="http://schemas.microsoft.com/office/word/2010/wordprocessingShape" mc:Ignorable="w14 w15 w16se w16cid w16 w16cex w16sdtdh wp14">
+<w:document xmlns:wpc="http://schemas.microsoft.com/office/word/2010/wordprocessingCanvas" xmlns:cx="http://schemas.microsoft.com/office/drawing/2014/chartex" xmlns:cx1="http://schemas.microsoft.com/office/drawing/2015/9/8/chartex" xmlns:cx2="http://schemas.microsoft.com/office/drawing/2015/10/21/chartex" xmlns:cx3="http://schemas.microsoft.com/office/drawing/2016/5/9/chartex" xmlns:cx4="http://schemas.microsoft.com/office/drawing/2016/5/10/chartex" xmlns:cx5="http://schemas.microsoft.com/office/drawing/2016/5/11/chartex" xmlns:cx6="http://schemas.microsoft.com/office/drawing/2016/5/12/chartex" xmlns:cx7="http://schemas.microsoft.com/office/drawing/2016/5/13/chartex" xmlns:cx8="http://schemas.microsoft.com/office/drawing/2016/5/14/chartex" xmlns:mc="http://schemas.openxmlformats.org/markup-compatibility/2006" xmlns:aink="http://schemas.microsoft.com/office/drawing/2016/ink" xmlns:am3d="http://schemas.microsoft.com/office/drawing/2017/model3d" xmlns:o="urn:schemas-microsoft-com:office:office" xmlns:oel="http://schemas.microsoft.com/office/2019/extlst" xmlns:r="http://schemas.openxmlformats.org/officeDocument/2006/relationships" xmlns:m="http://schemas.openxmlformats.org/officeDocument/2006/math" xmlns:v="urn:schemas-microsoft-com:vml" xmlns:wp14="http://schemas.microsoft.com/office/word/2010/wordprocessingDrawing" xmlns:wp="http://schemas.openxmlformats.org/drawingml/2006/wordprocessingDrawing" xmlns:w10="urn:schemas-microsoft-com:office:word" xmlns:w="http://schemas.openxmlformats.org/wordprocessingml/2006/main" xmlns:w14="http://schemas.microsoft.com/office/word/2010/wordml" xmlns:w15="http://schemas.microsoft.com/office/word/2012/wordml" xmlns:w16cex="http://schemas.microsoft.com/office/word/2018/wordml/cex" xmlns:w16cid="http://schemas.microsoft.com/office/word/2016/wordml/cid" xmlns:w16="http://schemas.microsoft.com/office/word/2018/wordml" xmlns:w16du="http://schemas.microsoft.com/office/word/2023/wordml/word16du" xmlns:w16sdtdh="http://schemas.microsoft.com/office/word/2020/wordml/sdtdatahash" xmlns:w16sdtfl="http://schemas.microsoft.com/office/word/2024/wordml/sdtformatlock" xmlns:w16se="http://schemas.microsoft.com/office/word/2015/wordml/symex" xmlns:wpg="http://schemas.microsoft.com/office/word/2010/wordprocessingGroup" xmlns:wpi="http://schemas.microsoft.com/office/word/2010/wordprocessingInk" xmlns:wne="http://schemas.microsoft.com/office/word/2006/wordml" xmlns:wps="http://schemas.microsoft.com/office/word/2010/wordprocessingShape" mc:Ignorable="w14 w15 w16se w16cid w16 w16cex w16sdtdh w16sdtfl w16du wp14">
   <w:body>
     <w:p>
       <w:r>
@@ -1522,7 +1522,7 @@
         </w:rPr>
         <w:lastRenderedPageBreak/>
         <w:drawing>
-          <wp:inline distT="0" distB="0" distL="0" distR="0" wp14:anchorId="78D3728F" wp14:editId="264C1470">
+          <wp:inline distT="0" distB="0" distL="0" distR="0" wp14:anchorId="78D3728F" wp14:editId="6E736E6C">
             <wp:extent cx="2497127" cy="4418162"/>
             <wp:effectExtent l="114300" t="76200" r="55880" b="135255"/>
             <wp:docPr id="8" name="Image 8"/>
@@ -1657,6 +1657,72 @@
     </w:p>
     <w:p>
       <w:pPr>
+        <w:pStyle w:val="NormalWeb"/>
+      </w:pPr>
+      <w:proofErr w:type="spellStart"/>
+      <w:r>
+        <w:t>Vxu</w:t>
+      </w:r>
+      <w:proofErr w:type="spellEnd"/>
+      <w:r>
+        <w:t xml:space="preserve"> </w:t>
+      </w:r>
+      <w:proofErr w:type="spellStart"/>
+      <w:r>
+        <w:t>yrwuh</w:t>
+      </w:r>
+      <w:proofErr w:type="spellEnd"/>
+      <w:r>
+        <w:t xml:space="preserve"> </w:t>
+      </w:r>
+      <w:proofErr w:type="spellStart"/>
+      <w:r>
+        <w:t>fkhplq</w:t>
+      </w:r>
+      <w:proofErr w:type="spellEnd"/>
+      <w:r>
+        <w:t xml:space="preserve">, </w:t>
+      </w:r>
+      <w:proofErr w:type="spellStart"/>
+      <w:r>
+        <w:t>ohv</w:t>
+      </w:r>
+      <w:proofErr w:type="spellEnd"/>
+      <w:r>
+        <w:t xml:space="preserve"> </w:t>
+      </w:r>
+      <w:proofErr w:type="spellStart"/>
+      <w:r>
+        <w:t>Flvhdxa</w:t>
+      </w:r>
+      <w:proofErr w:type="spellEnd"/>
+      <w:r>
+        <w:t xml:space="preserve"> </w:t>
+      </w:r>
+      <w:proofErr w:type="spellStart"/>
+      <w:r>
+        <w:t>Hqfkdqwhv</w:t>
+      </w:r>
+      <w:proofErr w:type="spellEnd"/>
+      <w:r>
+        <w:t xml:space="preserve">, </w:t>
+      </w:r>
+      <w:proofErr w:type="spellStart"/>
+      <w:r>
+        <w:t>fduwh</w:t>
+      </w:r>
+      <w:proofErr w:type="spellEnd"/>
+      <w:r>
+        <w:t xml:space="preserve"> </w:t>
+      </w:r>
+      <w:proofErr w:type="spellStart"/>
+      <w:r>
+        <w:t>flqtxdqwh</w:t>
+      </w:r>
+      <w:proofErr w:type="spellEnd"/>
+    </w:p>
+    <w:p>
+      <w:pPr>
         <w:pStyle w:val="Titre3"/>
       </w:pPr>
       <w:r>
@@ -1720,6 +1786,7 @@
         <w:rPr>
           <w:rStyle w:val="lev"/>
         </w:rPr>
+        <w:lastRenderedPageBreak/>
         <w:t>Carte :</w:t>
       </w:r>
       <w:r>
@@ -1750,381 +1817,487 @@
         <w:t>Léo le Laitier :</w:t>
       </w:r>
       <w:r>
-        <w:t xml:space="preserve"> "Suivez-moi jusqu'aux Cascades d'Égouttage. Ces cascades sont essentielles pour égoutter le caillé découpé. Répondez aux trois questions suivantes pour débloquer le passage secret sous la cascade : </w:t>
+        <w:t xml:space="preserve"> "Suivez-moi jusqu'aux Cascades d'Égouttage. Ces cascades sont essentielles pour égoutter le caillé découpé. Répondez aux trois questions suivantes pour débloquer le passage secret sous la cascade : Quels sont les trois facteurs importants dans le processus d'égouttage ? (Réponse : Le temps, la température et la pression)"</w:t>
+      </w:r>
+    </w:p>
+    <w:p>
+      <w:pPr>
+        <w:pStyle w:val="Titre3"/>
+      </w:pPr>
+      <w:r>
+        <w:t>Énigme 4 : Le Labyrinthe de Lactose</w:t>
+      </w:r>
+    </w:p>
+    <w:p>
+      <w:pPr>
+        <w:pStyle w:val="NormalWeb"/>
+      </w:pPr>
+      <w:r>
+        <w:rPr>
+          <w:rStyle w:val="lev"/>
+        </w:rPr>
+        <w:t>Carte :</w:t>
+      </w:r>
+      <w:r>
+        <w:t xml:space="preserve"> </w:t>
+      </w:r>
+      <w:r>
+        <w:rPr>
+          <w:rStyle w:val="lev"/>
+        </w:rPr>
+        <w:t>Titre</w:t>
+      </w:r>
+      <w:r>
+        <w:t xml:space="preserve"> : Le Labyrinthe de Lactose </w:t>
+      </w:r>
+      <w:r>
+        <w:rPr>
+          <w:rStyle w:val="lev"/>
+        </w:rPr>
+        <w:t>Texte :</w:t>
+      </w:r>
+      <w:r>
+        <w:t xml:space="preserve"> </w:t>
+      </w:r>
+      <w:r>
+        <w:rPr>
+          <w:rStyle w:val="Accentuation"/>
+        </w:rPr>
+        <w:t>Maître Fromager Firmin :</w:t>
+      </w:r>
+      <w:r>
+        <w:t xml:space="preserve"> "Sous la cascade, vous découvrirez un labyrinthe rempli de pièges laitiers. Suivez mes indices pour trouver la sortie : droite, gauche, droite, tout droit. Gardez l'esprit clair et avancez avec prudence."</w:t>
+      </w:r>
+    </w:p>
+    <w:p>
+      <w:pPr>
+        <w:pStyle w:val="Titre3"/>
+      </w:pPr>
+      <w:r>
+        <w:t>Énigme 5 : Le Chant des Mousselines</w:t>
+      </w:r>
+    </w:p>
+    <w:p>
+      <w:pPr>
+        <w:pStyle w:val="NormalWeb"/>
+      </w:pPr>
+      <w:r>
+        <w:rPr>
+          <w:rStyle w:val="lev"/>
+        </w:rPr>
+        <w:t>Carte :</w:t>
+      </w:r>
+      <w:r>
+        <w:t xml:space="preserve"> </w:t>
+      </w:r>
+      <w:r>
+        <w:rPr>
+          <w:rStyle w:val="lev"/>
+        </w:rPr>
+        <w:t>Titre</w:t>
+      </w:r>
+      <w:r>
+        <w:t xml:space="preserve"> : Le Chant des Mousselines </w:t>
+      </w:r>
+      <w:r>
+        <w:rPr>
+          <w:rStyle w:val="lev"/>
+        </w:rPr>
+        <w:t>Texte :</w:t>
+      </w:r>
+      <w:r>
+        <w:t xml:space="preserve"> </w:t>
+      </w:r>
+      <w:r>
+        <w:rPr>
+          <w:rStyle w:val="Accentuation"/>
+        </w:rPr>
+        <w:t>Clara la Caillée :</w:t>
+      </w:r>
+      <w:r>
+        <w:t xml:space="preserve"> "Les Mousselines de Lait sont des créatures merveilleuses qui chantent pour guider nos pas. Écoutez attentivement leur mélodie : 'Égoutte doucement, égoutte lentement, pour un fromage parfait, c'est le moment.' Suivez leur chanson pour découvrir la prochaine étape."</w:t>
+      </w:r>
+    </w:p>
+    <w:p>
+      <w:pPr>
+        <w:pStyle w:val="Titre3"/>
+      </w:pPr>
+      <w:r>
+        <w:t>Énigme 6 : Les Tours de Séchage</w:t>
+      </w:r>
+    </w:p>
+    <w:p>
+      <w:pPr>
+        <w:pStyle w:val="NormalWeb"/>
+      </w:pPr>
+      <w:r>
+        <w:rPr>
+          <w:rStyle w:val="lev"/>
+        </w:rPr>
+        <w:t>Carte :</w:t>
+      </w:r>
+      <w:r>
+        <w:t xml:space="preserve"> </w:t>
+      </w:r>
+      <w:r>
+        <w:rPr>
+          <w:rStyle w:val="lev"/>
+        </w:rPr>
+        <w:t>Titre</w:t>
+      </w:r>
+      <w:r>
+        <w:t xml:space="preserve"> : Les Tours de Séchage </w:t>
+      </w:r>
+      <w:r>
+        <w:rPr>
+          <w:rStyle w:val="lev"/>
+        </w:rPr>
+        <w:t>Texte :</w:t>
+      </w:r>
+      <w:r>
+        <w:t xml:space="preserve"> </w:t>
+      </w:r>
+      <w:r>
+        <w:rPr>
+          <w:rStyle w:val="Accentuation"/>
+        </w:rPr>
+        <w:t>Léo le Laitier :</w:t>
+      </w:r>
+      <w:r>
+        <w:t xml:space="preserve"> "Les Tours de Séchage sont des structures majestueuses où le caillé égoutté est laissé à sécher. Assemblez les morceaux de caillé séché pour reconstituer le dessin d'un fromage complet avec des trous et des motifs distinctifs. Cela révélera votre prochaine destination."</w:t>
+      </w:r>
+    </w:p>
+    <w:p>
+      <w:pPr>
+        <w:pStyle w:val="Titre3"/>
+      </w:pPr>
+      <w:r>
+        <w:t>Énigme 7 : Le Vent des Secrets</w:t>
+      </w:r>
+    </w:p>
+    <w:p>
+      <w:pPr>
+        <w:pStyle w:val="NormalWeb"/>
+      </w:pPr>
+      <w:r>
+        <w:rPr>
+          <w:rStyle w:val="lev"/>
+        </w:rPr>
+        <w:t>Carte :</w:t>
+      </w:r>
+      <w:r>
+        <w:t xml:space="preserve"> </w:t>
+      </w:r>
+      <w:r>
+        <w:rPr>
+          <w:rStyle w:val="lev"/>
+        </w:rPr>
+        <w:t>Titre</w:t>
+      </w:r>
+      <w:r>
+        <w:t xml:space="preserve"> : Le Vent des Secrets </w:t>
+      </w:r>
+      <w:r>
+        <w:rPr>
+          <w:rStyle w:val="lev"/>
+        </w:rPr>
+        <w:t>Texte :</w:t>
+      </w:r>
+      <w:r>
+        <w:t xml:space="preserve"> </w:t>
+      </w:r>
+      <w:r>
+        <w:rPr>
+          <w:rStyle w:val="Accentuation"/>
+        </w:rPr>
+        <w:t>Maître Fromager Firmin :</w:t>
+      </w:r>
+      <w:r>
+        <w:t xml:space="preserve"> "Les vents murmurent des secrets anciens. Ajustez les moulins à vent pour capter les messages cachés et découvrir l'emplacement suivant. Écoutez attentivement les murmures du vent pour trouver votre chemin."</w:t>
+      </w:r>
+    </w:p>
+    <w:p>
+      <w:pPr>
+        <w:pStyle w:val="Titre3"/>
+      </w:pPr>
+      <w:r>
+        <w:t>Énigme 8 : La Bibliothèque Fromagère</w:t>
+      </w:r>
+    </w:p>
+    <w:p>
+      <w:pPr>
+        <w:pStyle w:val="NormalWeb"/>
+      </w:pPr>
+      <w:r>
+        <w:rPr>
+          <w:rStyle w:val="lev"/>
+        </w:rPr>
+        <w:t>Carte :</w:t>
+      </w:r>
+      <w:r>
+        <w:t xml:space="preserve"> </w:t>
+      </w:r>
+      <w:r>
+        <w:rPr>
+          <w:rStyle w:val="lev"/>
+        </w:rPr>
+        <w:t>Titre</w:t>
+      </w:r>
+      <w:r>
+        <w:t xml:space="preserve"> : La Bibliothèque Fromagère </w:t>
+      </w:r>
+      <w:r>
+        <w:rPr>
+          <w:rStyle w:val="lev"/>
+        </w:rPr>
+        <w:t>Texte :</w:t>
+      </w:r>
+      <w:r>
+        <w:t xml:space="preserve"> </w:t>
+      </w:r>
+      <w:r>
+        <w:rPr>
+          <w:rStyle w:val="Accentuation"/>
+        </w:rPr>
+        <w:t>Clara la Caillée :</w:t>
+      </w:r>
+      <w:r>
+        <w:t xml:space="preserve"> "Dans l'ancienne Bibliothèque Fromagère, trouvez le livre rare intitulé 'Les Secrets du Fromage Ancien'. Déchiffrez la recette qui s'y trouve pour révéler l'emplacement du Caillé d'Or. Explorez chaque recoin de la bibliothèque pour trouver des indices."</w:t>
+      </w:r>
+    </w:p>
+    <w:p>
+      <w:pPr>
+        <w:pStyle w:val="Titre3"/>
+      </w:pPr>
+      <w:r>
+        <w:t>Énigme 9 : Le Garde du Caillé</w:t>
+      </w:r>
+    </w:p>
+    <w:p>
+      <w:pPr>
+        <w:pStyle w:val="NormalWeb"/>
+      </w:pPr>
+      <w:r>
+        <w:rPr>
+          <w:rStyle w:val="lev"/>
+        </w:rPr>
+        <w:t>Carte :</w:t>
+      </w:r>
+      <w:r>
+        <w:t xml:space="preserve"> </w:t>
+      </w:r>
+      <w:r>
+        <w:rPr>
+          <w:rStyle w:val="lev"/>
+        </w:rPr>
+        <w:t>Titre</w:t>
+      </w:r>
+      <w:r>
+        <w:t xml:space="preserve"> : Le Garde du Caillé </w:t>
+      </w:r>
+      <w:r>
+        <w:rPr>
+          <w:rStyle w:val="lev"/>
+        </w:rPr>
+        <w:t>Texte :</w:t>
+      </w:r>
+      <w:r>
+        <w:t xml:space="preserve"> </w:t>
+      </w:r>
+      <w:r>
+        <w:rPr>
+          <w:rStyle w:val="Accentuation"/>
+        </w:rPr>
+        <w:t>Léo le Laitier :</w:t>
+      </w:r>
+      <w:r>
+        <w:t xml:space="preserve"> "Pour accéder au Caillé d'Or, résolvez l'énigme du gardien : Quelles sont les étapes de la fabrication du fromage ? (Réponse : Le lait, le caillé, le découpage, l'égouttage, le salage, et la maturation). Prouvez votre connaissance et votre courage pour continuer."</w:t>
+      </w:r>
+    </w:p>
+    <w:p>
+      <w:pPr>
+        <w:pStyle w:val="NormalWeb"/>
+      </w:pPr>
+    </w:p>
+    <w:p>
+      <w:pPr>
+        <w:pStyle w:val="NormalWeb"/>
+      </w:pPr>
+    </w:p>
+    <w:p>
+      <w:pPr>
+        <w:pStyle w:val="NormalWeb"/>
+      </w:pPr>
+    </w:p>
+    <w:p>
+      <w:pPr>
+        <w:pStyle w:val="Titre3"/>
+      </w:pPr>
+      <w:r>
+        <w:t>Énigme 10 : Le Trésor de Firmin</w:t>
+      </w:r>
+    </w:p>
+    <w:p>
+      <w:pPr>
+        <w:pStyle w:val="NormalWeb"/>
+      </w:pPr>
+      <w:r>
+        <w:rPr>
+          <w:rStyle w:val="lev"/>
+        </w:rPr>
+        <w:t>Carte :</w:t>
+      </w:r>
+      <w:r>
+        <w:t xml:space="preserve"> </w:t>
+      </w:r>
+      <w:r>
+        <w:rPr>
+          <w:rStyle w:val="lev"/>
+        </w:rPr>
+        <w:t>Titre</w:t>
+      </w:r>
+      <w:r>
+        <w:t xml:space="preserve"> : Le Trésor de Firmin </w:t>
+      </w:r>
+      <w:r>
+        <w:rPr>
+          <w:rStyle w:val="lev"/>
+        </w:rPr>
+        <w:t>Texte :</w:t>
+      </w:r>
+      <w:r>
+        <w:t xml:space="preserve"> </w:t>
+      </w:r>
+      <w:r>
+        <w:rPr>
+          <w:rStyle w:val="Accentuation"/>
+        </w:rPr>
+        <w:t>Maître Fromager Firmin :</w:t>
+      </w:r>
+      <w:r>
+        <w:t xml:space="preserve"> "Vous êtes presque au bout de votre quête. Utilisez les réponses aux énigmes précédentes pour former le mot de passe et déverrouiller le coffre contenant le Caillé d'Or : '</w:t>
+      </w:r>
+      <w:proofErr w:type="spellStart"/>
+      <w:r>
+        <w:t>FromageParfait</w:t>
+      </w:r>
+      <w:proofErr w:type="spellEnd"/>
+      <w:r>
+        <w:t>'. Bravo, aventuriers, pour votre persévérance et votre esprit d'équipe !"</w:t>
+      </w:r>
+    </w:p>
+    <w:p>
+      <w:pPr>
+        <w:pStyle w:val="NormalWeb"/>
+      </w:pPr>
+    </w:p>
+    <w:p>
+      <w:pPr>
+        <w:pStyle w:val="NormalWeb"/>
+      </w:pPr>
+      <w:r>
+        <w:t>L'égouttage du caillé est une étape clé de la fabrication du fromage, et il ne s'agit pas simplement de séparer le lactosérum du caillé. Pour obtenir la bonne texture et la bonne consistance du fromage, plusieurs facteurs doivent être soigneusement contrôlés. Ces éléments influencent la vitesse à laquelle le lactosérum se sépare, la texture du fromage et même son goût.</w:t>
+      </w:r>
+    </w:p>
+    <w:p>
+      <w:pPr>
+        <w:pStyle w:val="NormalWeb"/>
+      </w:pPr>
+      <w:r>
+        <w:t>Tout d'abord, il est essentiel de prêter attention à la durée d'égouttage. Un caillé qui reste trop longtemps dans la cuve risque de devenir trop sec et friable. En revanche, si l'égouttage est trop rapide, le fromage aura tendance à être trop humide et moins ferme. Le temps d'égouttage idéal varie selon le type de fromage que vous souhaitez obtenir, mais il doit toujours être soigneusement ajusté.</w:t>
+      </w:r>
+    </w:p>
+    <w:p>
+      <w:pPr>
+        <w:pStyle w:val="NormalWeb"/>
+      </w:pPr>
+      <w:r>
+        <w:t>Ensuite, un autre facteur fondamental est la température du caillé pendant l'égouttage. L'égouttage à température ambiante peut prendre beaucoup de temps, mais augmenter la chaleur permet d'accélérer le processus. Cependant, il faut éviter des températures trop élevées, car cela pourrait altérer la structure du caillé, le rendant trop friable ou provoquant la perte de certains arômes. En ajustant la température de manière précise, vous pouvez contrôler la texture du fromage, qu’il soit tendre ou plus ferme, selon vos préférences.</w:t>
+      </w:r>
+    </w:p>
+    <w:p>
+      <w:pPr>
+        <w:pStyle w:val="NormalWeb"/>
+      </w:pPr>
+      <w:r>
+        <w:t>Il est également important de considérer la pression appliquée pendant l’égouttage. En effet, l'ajout d'une pression légère sur le caillé permet de favoriser l'élimination du lactosérum. Cela permet non seulement de sécher le caillé plus rapidement, mais aussi de lui donner une consistance plus ferme et compacte. Toutefois, un excès de pression peut avoir l'effet inverse, en écrasant trop les grains de caillé, ce qui altère la texture du fromage.</w:t>
+      </w:r>
+    </w:p>
+    <w:p>
+      <w:pPr>
+        <w:pStyle w:val="NormalWeb"/>
+      </w:pPr>
+      <w:r>
+        <w:t>L'égouttage se déroule dans des équipements spécialement conçus pour cela, où le caillé est souvent transféré dans des paniers ou des moules perforés qui permettent au lactosérum de s'échapper naturellement. Cette étape est cruciale pour obtenir un fromage avec la bonne proportion de matière grasse et de protéines, ce qui impacte directement son goût et sa texture.</w:t>
+      </w:r>
+    </w:p>
+    <w:p>
+      <w:pPr>
+        <w:pStyle w:val="NormalWeb"/>
+      </w:pPr>
+      <w:r>
+        <w:t>Certains fromagers préfèrent également ajuster ces facteurs en fonction des conditions environnementales, comme l'humidité et la température de l'air ambiant, car ces éléments peuvent affecter le temps d'égouttage et la texture du fromage. Une humidité trop élevée peut ralentir l'égouttage, tandis qu'une faible humidité pourrait le rendre trop rapide.</w:t>
+      </w:r>
+    </w:p>
+    <w:p>
+      <w:pPr>
+        <w:pStyle w:val="NormalWeb"/>
+      </w:pPr>
+      <w:r>
+        <w:t xml:space="preserve">En résumé, bien que l'égouttage semble simple en apparence, il nécessite une gestion minutieuse de trois éléments clés : le temps, la température et la pression. Ces facteurs </w:t>
       </w:r>
       <w:r>
         <w:lastRenderedPageBreak/>
-        <w:t>Quels sont les trois facteurs importants dans le processus d'égouttage ? (Réponse : Le temps, la température et la pression)"</w:t>
-      </w:r>
-    </w:p>
-    <w:p>
-      <w:pPr>
-        <w:pStyle w:val="Titre3"/>
-      </w:pPr>
-      <w:r>
-        <w:t>Énigme 4 : Le Labyrinthe de Lactose</w:t>
-      </w:r>
-    </w:p>
-    <w:p>
-      <w:pPr>
-        <w:pStyle w:val="NormalWeb"/>
-      </w:pPr>
-      <w:r>
-        <w:rPr>
-          <w:rStyle w:val="lev"/>
-        </w:rPr>
-        <w:t>Carte :</w:t>
-      </w:r>
-      <w:r>
-        <w:t xml:space="preserve"> </w:t>
-      </w:r>
-      <w:r>
-        <w:rPr>
-          <w:rStyle w:val="lev"/>
-        </w:rPr>
-        <w:t>Titre</w:t>
-      </w:r>
-      <w:r>
-        <w:t xml:space="preserve"> : Le Labyrinthe de Lactose </w:t>
-      </w:r>
-      <w:r>
-        <w:rPr>
-          <w:rStyle w:val="lev"/>
-        </w:rPr>
-        <w:t>Texte :</w:t>
-      </w:r>
-      <w:r>
-        <w:t xml:space="preserve"> </w:t>
-      </w:r>
-      <w:r>
-        <w:rPr>
-          <w:rStyle w:val="Accentuation"/>
-        </w:rPr>
-        <w:t>Maître Fromager Firmin :</w:t>
-      </w:r>
-      <w:r>
-        <w:t xml:space="preserve"> "Sous la cascade, vous découvrirez un labyrinthe rempli de pièges laitiers. Suivez mes indices pour trouver la sortie : droite, gauche, droite, tout droit. Gardez l'esprit clair et avancez avec prudence."</w:t>
-      </w:r>
-    </w:p>
-    <w:p>
-      <w:pPr>
-        <w:pStyle w:val="Titre3"/>
-      </w:pPr>
-      <w:r>
-        <w:t>Énigme 5 : Le Chant des Mousselines</w:t>
-      </w:r>
-    </w:p>
-    <w:p>
-      <w:pPr>
-        <w:pStyle w:val="NormalWeb"/>
-      </w:pPr>
-      <w:r>
-        <w:rPr>
-          <w:rStyle w:val="lev"/>
-        </w:rPr>
-        <w:t>Carte :</w:t>
-      </w:r>
-      <w:r>
-        <w:t xml:space="preserve"> </w:t>
-      </w:r>
-      <w:r>
-        <w:rPr>
-          <w:rStyle w:val="lev"/>
-        </w:rPr>
-        <w:t>Titre</w:t>
-      </w:r>
-      <w:r>
-        <w:t xml:space="preserve"> : Le Chant des Mousselines </w:t>
-      </w:r>
-      <w:r>
-        <w:rPr>
-          <w:rStyle w:val="lev"/>
-        </w:rPr>
-        <w:t>Texte :</w:t>
-      </w:r>
-      <w:r>
-        <w:t xml:space="preserve"> </w:t>
-      </w:r>
-      <w:r>
-        <w:rPr>
-          <w:rStyle w:val="Accentuation"/>
-        </w:rPr>
-        <w:t>Clara la Caillée :</w:t>
-      </w:r>
-      <w:r>
-        <w:t xml:space="preserve"> "Les Mousselines de Lait sont des créatures merveilleuses qui chantent pour guider nos pas. Écoutez attentivement leur mélodie : 'Égoutte doucement, égoutte lentement, pour un fromage parfait, c'est le moment.' Suivez leur chanson pour découvrir la prochaine étape."</w:t>
-      </w:r>
-    </w:p>
-    <w:p>
-      <w:pPr>
-        <w:pStyle w:val="Titre3"/>
-      </w:pPr>
-      <w:r>
-        <w:t>Énigme 6 : Les Tours de Séchage</w:t>
-      </w:r>
-    </w:p>
-    <w:p>
-      <w:pPr>
-        <w:pStyle w:val="NormalWeb"/>
-      </w:pPr>
-      <w:r>
-        <w:rPr>
-          <w:rStyle w:val="lev"/>
-        </w:rPr>
-        <w:t>Carte :</w:t>
-      </w:r>
-      <w:r>
-        <w:t xml:space="preserve"> </w:t>
-      </w:r>
-      <w:r>
-        <w:rPr>
-          <w:rStyle w:val="lev"/>
-        </w:rPr>
-        <w:t>Titre</w:t>
-      </w:r>
-      <w:r>
-        <w:t xml:space="preserve"> : Les Tours de Séchage </w:t>
-      </w:r>
-      <w:r>
-        <w:rPr>
-          <w:rStyle w:val="lev"/>
-        </w:rPr>
-        <w:t>Texte :</w:t>
-      </w:r>
-      <w:r>
-        <w:t xml:space="preserve"> </w:t>
-      </w:r>
-      <w:r>
-        <w:rPr>
-          <w:rStyle w:val="Accentuation"/>
-        </w:rPr>
-        <w:t>Léo le Laitier :</w:t>
-      </w:r>
-      <w:r>
-        <w:t xml:space="preserve"> "Les Tours de Séchage sont des structures majestueuses où le caillé égoutté est laissé à sécher. Assemblez les morceaux de caillé séché pour reconstituer le dessin d'un fromage complet avec des trous et des motifs distinctifs. Cela révélera votre prochaine destination."</w:t>
-      </w:r>
-    </w:p>
-    <w:p>
-      <w:pPr>
-        <w:pStyle w:val="Titre3"/>
-      </w:pPr>
-      <w:r>
-        <w:t>Énigme 7 : Le Vent des Secrets</w:t>
-      </w:r>
-    </w:p>
-    <w:p>
-      <w:pPr>
-        <w:pStyle w:val="NormalWeb"/>
-      </w:pPr>
-      <w:r>
-        <w:rPr>
-          <w:rStyle w:val="lev"/>
-        </w:rPr>
-        <w:t>Carte :</w:t>
-      </w:r>
-      <w:r>
-        <w:t xml:space="preserve"> </w:t>
-      </w:r>
-      <w:r>
-        <w:rPr>
-          <w:rStyle w:val="lev"/>
-        </w:rPr>
-        <w:t>Titre</w:t>
-      </w:r>
-      <w:r>
-        <w:t xml:space="preserve"> : Le Vent des Secrets </w:t>
-      </w:r>
-      <w:r>
-        <w:rPr>
-          <w:rStyle w:val="lev"/>
-        </w:rPr>
-        <w:t>Texte :</w:t>
-      </w:r>
-      <w:r>
-        <w:t xml:space="preserve"> </w:t>
-      </w:r>
-      <w:r>
-        <w:rPr>
-          <w:rStyle w:val="Accentuation"/>
-        </w:rPr>
-        <w:t>Maître Fromager Firmin :</w:t>
-      </w:r>
-      <w:r>
-        <w:t xml:space="preserve"> "Les vents murmurent des secrets anciens. Ajustez les moulins à vent pour capter les messages cachés et découvrir l'emplacement suivant. Écoutez attentivement les murmures du vent pour trouver votre chemin."</w:t>
-      </w:r>
-    </w:p>
-    <w:p>
-      <w:pPr>
-        <w:pStyle w:val="Titre3"/>
-      </w:pPr>
-      <w:r>
-        <w:t>Énigme 8 : La Bibliothèque Fromagère</w:t>
-      </w:r>
-    </w:p>
-    <w:p>
-      <w:pPr>
-        <w:pStyle w:val="NormalWeb"/>
-      </w:pPr>
-      <w:r>
-        <w:rPr>
-          <w:rStyle w:val="lev"/>
-        </w:rPr>
-        <w:t>Carte :</w:t>
-      </w:r>
-      <w:r>
-        <w:t xml:space="preserve"> </w:t>
-      </w:r>
-      <w:r>
-        <w:rPr>
-          <w:rStyle w:val="lev"/>
-        </w:rPr>
-        <w:t>Titre</w:t>
-      </w:r>
-      <w:r>
-        <w:t xml:space="preserve"> : La Bibliothèque Fromagère </w:t>
-      </w:r>
-      <w:r>
-        <w:rPr>
-          <w:rStyle w:val="lev"/>
-        </w:rPr>
-        <w:t>Texte :</w:t>
-      </w:r>
-      <w:r>
-        <w:t xml:space="preserve"> </w:t>
-      </w:r>
-      <w:r>
-        <w:rPr>
-          <w:rStyle w:val="Accentuation"/>
-        </w:rPr>
-        <w:t>Clara la Caillée :</w:t>
-      </w:r>
-      <w:r>
-        <w:t xml:space="preserve"> "Dans l'ancienne Bibliothèque Fromagère, trouvez le livre rare intitulé 'Les Secrets du Fromage Ancien'. Déchiffrez la recette qui s'y trouve pour révéler l'emplacement du Caillé d'Or. Explorez chaque recoin de la bibliothèque pour trouver des indices."</w:t>
-      </w:r>
-    </w:p>
-    <w:p>
-      <w:pPr>
-        <w:pStyle w:val="Titre3"/>
-      </w:pPr>
-      <w:r>
-        <w:t>Énigme 9 : Le Garde du Caillé</w:t>
-      </w:r>
-    </w:p>
-    <w:p>
-      <w:pPr>
-        <w:pStyle w:val="NormalWeb"/>
-      </w:pPr>
-      <w:r>
-        <w:rPr>
-          <w:rStyle w:val="lev"/>
-        </w:rPr>
-        <w:t>Carte :</w:t>
-      </w:r>
-      <w:r>
-        <w:t xml:space="preserve"> </w:t>
-      </w:r>
-      <w:r>
-        <w:rPr>
-          <w:rStyle w:val="lev"/>
-        </w:rPr>
-        <w:t>Titre</w:t>
-      </w:r>
-      <w:r>
-        <w:t xml:space="preserve"> : Le Garde du Caillé </w:t>
-      </w:r>
-      <w:r>
-        <w:rPr>
-          <w:rStyle w:val="lev"/>
-        </w:rPr>
-        <w:t>Texte :</w:t>
-      </w:r>
-      <w:r>
-        <w:t xml:space="preserve"> </w:t>
-      </w:r>
-      <w:r>
-        <w:rPr>
-          <w:rStyle w:val="Accentuation"/>
-        </w:rPr>
-        <w:t>Léo le Laitier :</w:t>
-      </w:r>
-      <w:r>
-        <w:t xml:space="preserve"> "Pour accéder au Caillé d'Or, résolvez l'énigme du gardien : Quelles sont les étapes de la fabrication du fromage ? (Réponse : Le lait, le caillé, le découpage, l'égouttage, le salage, et la maturation). Prouvez votre connaissance et votre courage pour continuer."</w:t>
-      </w:r>
-    </w:p>
-    <w:p>
-      <w:pPr>
-        <w:pStyle w:val="NormalWeb"/>
-      </w:pPr>
-    </w:p>
-    <w:p>
-      <w:pPr>
-        <w:pStyle w:val="NormalWeb"/>
-      </w:pPr>
-    </w:p>
-    <w:p>
-      <w:pPr>
-        <w:pStyle w:val="NormalWeb"/>
-      </w:pPr>
-    </w:p>
-    <w:p>
-      <w:pPr>
-        <w:pStyle w:val="Titre3"/>
-      </w:pPr>
-      <w:r>
-        <w:lastRenderedPageBreak/>
-        <w:t>Énigme 10 : Le Trésor de Firmin</w:t>
-      </w:r>
-    </w:p>
-    <w:p>
-      <w:pPr>
-        <w:pStyle w:val="NormalWeb"/>
-      </w:pPr>
-      <w:r>
-        <w:rPr>
-          <w:rStyle w:val="lev"/>
-        </w:rPr>
-        <w:t>Carte :</w:t>
-      </w:r>
-      <w:r>
-        <w:t xml:space="preserve"> </w:t>
-      </w:r>
-      <w:r>
-        <w:rPr>
-          <w:rStyle w:val="lev"/>
-        </w:rPr>
-        <w:t>Titre</w:t>
-      </w:r>
-      <w:r>
-        <w:t xml:space="preserve"> : Le Trésor de Firmin </w:t>
-      </w:r>
-      <w:r>
-        <w:rPr>
-          <w:rStyle w:val="lev"/>
-        </w:rPr>
-        <w:t>Texte :</w:t>
-      </w:r>
-      <w:r>
-        <w:t xml:space="preserve"> </w:t>
-      </w:r>
-      <w:r>
-        <w:rPr>
-          <w:rStyle w:val="Accentuation"/>
-        </w:rPr>
-        <w:t>Maître Fromager Firmin :</w:t>
-      </w:r>
-      <w:r>
-        <w:t xml:space="preserve"> "Vous êtes presque au bout de votre quête. Utilisez les réponses aux énigmes précédentes pour former le mot de passe et déverrouiller le coffre contenant le Caillé d'Or : '</w:t>
-      </w:r>
-      <w:proofErr w:type="spellStart"/>
-      <w:r>
-        <w:t>FromageParfait</w:t>
-      </w:r>
-      <w:proofErr w:type="spellEnd"/>
-      <w:r>
-        <w:t>'. Bravo, aventuriers, pour votre persévérance et votre esprit d'équipe !"</w:t>
-      </w:r>
-    </w:p>
-    <w:p/>
+        <w:t>déterminent la qualité finale du fromage et permettent de créer des fromages variés, allant des plus crémeux aux plus fermes. Pour réussir, il est essentiel de trouver l'équilibre parfait entre ces trois paramètres.</w:t>
+      </w:r>
+    </w:p>
+    <w:p>
+      <w:pPr>
+        <w:pStyle w:val="NormalWeb"/>
+      </w:pPr>
+    </w:p>
+    <w:p>
+      <w:pPr>
+        <w:jc w:val="center"/>
+      </w:pPr>
+      <w:r>
+        <w:drawing>
+          <wp:inline distT="0" distB="0" distL="0" distR="0" wp14:anchorId="06D1972E" wp14:editId="0956CAE1">
+            <wp:extent cx="4000529" cy="3933854"/>
+            <wp:effectExtent l="0" t="0" r="0" b="9525"/>
+            <wp:docPr id="1768828637" name="Image 1" descr="Une image contenant motif, carré, Symétrie, art&#10;&#10;Description générée automatiquement"/>
+            <wp:cNvGraphicFramePr>
+              <a:graphicFrameLocks xmlns:a="http://schemas.openxmlformats.org/drawingml/2006/main" noChangeAspect="1"/>
+            </wp:cNvGraphicFramePr>
+            <a:graphic xmlns:a="http://schemas.openxmlformats.org/drawingml/2006/main">
+              <a:graphicData uri="http://schemas.openxmlformats.org/drawingml/2006/picture">
+                <pic:pic xmlns:pic="http://schemas.openxmlformats.org/drawingml/2006/picture">
+                  <pic:nvPicPr>
+                    <pic:cNvPr id="1768828637" name="Image 1" descr="Une image contenant motif, carré, Symétrie, art&#10;&#10;Description générée automatiquement"/>
+                    <pic:cNvPicPr/>
+                  </pic:nvPicPr>
+                  <pic:blipFill>
+                    <a:blip r:embed="rId12"/>
+                    <a:stretch>
+                      <a:fillRect/>
+                    </a:stretch>
+                  </pic:blipFill>
+                  <pic:spPr>
+                    <a:xfrm>
+                      <a:off x="0" y="0"/>
+                      <a:ext cx="4000529" cy="3933854"/>
+                    </a:xfrm>
+                    <a:prstGeom prst="rect">
+                      <a:avLst/>
+                    </a:prstGeom>
+                  </pic:spPr>
+                </pic:pic>
+              </a:graphicData>
+            </a:graphic>
+          </wp:inline>
+        </w:drawing>
+      </w:r>
+    </w:p>
     <w:p/>
     <w:sectPr>
       <w:pgSz w:w="11906" w:h="16838"/>
@@ -2137,7 +2310,7 @@
 </file>
 
 <file path=word/numbering.xml><?xml version="1.0" encoding="utf-8"?>
-<w:numbering xmlns:wpc="http://schemas.microsoft.com/office/word/2010/wordprocessingCanvas" xmlns:cx="http://schemas.microsoft.com/office/drawing/2014/chartex" xmlns:cx1="http://schemas.microsoft.com/office/drawing/2015/9/8/chartex" xmlns:cx2="http://schemas.microsoft.com/office/drawing/2015/10/21/chartex" xmlns:cx3="http://schemas.microsoft.com/office/drawing/2016/5/9/chartex" xmlns:cx4="http://schemas.microsoft.com/office/drawing/2016/5/10/chartex" xmlns:cx5="http://schemas.microsoft.com/office/drawing/2016/5/11/chartex" xmlns:cx6="http://schemas.microsoft.com/office/drawing/2016/5/12/chartex" xmlns:cx7="http://schemas.microsoft.com/office/drawing/2016/5/13/chartex" xmlns:cx8="http://schemas.microsoft.com/office/drawing/2016/5/14/chartex" xmlns:mc="http://schemas.openxmlformats.org/markup-compatibility/2006" xmlns:aink="http://schemas.microsoft.com/office/drawing/2016/ink" xmlns:am3d="http://schemas.microsoft.com/office/drawing/2017/model3d" xmlns:o="urn:schemas-microsoft-com:office:office" xmlns:r="http://schemas.openxmlformats.org/officeDocument/2006/relationships" xmlns:m="http://schemas.openxmlformats.org/officeDocument/2006/math" xmlns:v="urn:schemas-microsoft-com:vml" xmlns:wp14="http://schemas.microsoft.com/office/word/2010/wordprocessingDrawing" xmlns:wp="http://schemas.openxmlformats.org/drawingml/2006/wordprocessingDrawing" xmlns:w10="urn:schemas-microsoft-com:office:word" xmlns:w="http://schemas.openxmlformats.org/wordprocessingml/2006/main" xmlns:w14="http://schemas.microsoft.com/office/word/2010/wordml" xmlns:w15="http://schemas.microsoft.com/office/word/2012/wordml" xmlns:w16cex="http://schemas.microsoft.com/office/word/2018/wordml/cex" xmlns:w16cid="http://schemas.microsoft.com/office/word/2016/wordml/cid" xmlns:w16="http://schemas.microsoft.com/office/word/2018/wordml" xmlns:w16sdtdh="http://schemas.microsoft.com/office/word/2020/wordml/sdtdatahash" xmlns:w16se="http://schemas.microsoft.com/office/word/2015/wordml/symex" xmlns:wpg="http://schemas.microsoft.com/office/word/2010/wordprocessingGroup" xmlns:wpi="http://schemas.microsoft.com/office/word/2010/wordprocessingInk" xmlns:wne="http://schemas.microsoft.com/office/word/2006/wordml" xmlns:wps="http://schemas.microsoft.com/office/word/2010/wordprocessingShape" mc:Ignorable="w14 w15 w16se w16cid w16 w16cex w16sdtdh wp14">
+<w:numbering xmlns:wpc="http://schemas.microsoft.com/office/word/2010/wordprocessingCanvas" xmlns:cx="http://schemas.microsoft.com/office/drawing/2014/chartex" xmlns:cx1="http://schemas.microsoft.com/office/drawing/2015/9/8/chartex" xmlns:cx2="http://schemas.microsoft.com/office/drawing/2015/10/21/chartex" xmlns:cx3="http://schemas.microsoft.com/office/drawing/2016/5/9/chartex" xmlns:cx4="http://schemas.microsoft.com/office/drawing/2016/5/10/chartex" xmlns:cx5="http://schemas.microsoft.com/office/drawing/2016/5/11/chartex" xmlns:cx6="http://schemas.microsoft.com/office/drawing/2016/5/12/chartex" xmlns:cx7="http://schemas.microsoft.com/office/drawing/2016/5/13/chartex" xmlns:cx8="http://schemas.microsoft.com/office/drawing/2016/5/14/chartex" xmlns:mc="http://schemas.openxmlformats.org/markup-compatibility/2006" xmlns:aink="http://schemas.microsoft.com/office/drawing/2016/ink" xmlns:am3d="http://schemas.microsoft.com/office/drawing/2017/model3d" xmlns:o="urn:schemas-microsoft-com:office:office" xmlns:oel="http://schemas.microsoft.com/office/2019/extlst" xmlns:r="http://schemas.openxmlformats.org/officeDocument/2006/relationships" xmlns:m="http://schemas.openxmlformats.org/officeDocument/2006/math" xmlns:v="urn:schemas-microsoft-com:vml" xmlns:wp14="http://schemas.microsoft.com/office/word/2010/wordprocessingDrawing" xmlns:wp="http://schemas.openxmlformats.org/drawingml/2006/wordprocessingDrawing" xmlns:w10="urn:schemas-microsoft-com:office:word" xmlns:w="http://schemas.openxmlformats.org/wordprocessingml/2006/main" xmlns:w14="http://schemas.microsoft.com/office/word/2010/wordml" xmlns:w15="http://schemas.microsoft.com/office/word/2012/wordml" xmlns:w16cex="http://schemas.microsoft.com/office/word/2018/wordml/cex" xmlns:w16cid="http://schemas.microsoft.com/office/word/2016/wordml/cid" xmlns:w16="http://schemas.microsoft.com/office/word/2018/wordml" xmlns:w16du="http://schemas.microsoft.com/office/word/2023/wordml/word16du" xmlns:w16sdtdh="http://schemas.microsoft.com/office/word/2020/wordml/sdtdatahash" xmlns:w16sdtfl="http://schemas.microsoft.com/office/word/2024/wordml/sdtformatlock" xmlns:w16se="http://schemas.microsoft.com/office/word/2015/wordml/symex" xmlns:wpg="http://schemas.microsoft.com/office/word/2010/wordprocessingGroup" xmlns:wpi="http://schemas.microsoft.com/office/word/2010/wordprocessingInk" xmlns:wne="http://schemas.microsoft.com/office/word/2006/wordml" xmlns:wps="http://schemas.microsoft.com/office/word/2010/wordprocessingShape" mc:Ignorable="w14 w15 w16se w16cid w16 w16cex w16sdtdh w16sdtfl w16du wp14">
   <w:abstractNum w:abstractNumId="0" w15:restartNumberingAfterBreak="0">
     <w:nsid w:val="199A52EA"/>
     <w:multiLevelType w:val="multilevel"/>
@@ -2287,14 +2460,14 @@
       </w:rPr>
     </w:lvl>
   </w:abstractNum>
-  <w:num w:numId="1">
+  <w:num w:numId="1" w16cid:durableId="1186292207">
     <w:abstractNumId w:val="0"/>
   </w:num>
 </w:numbering>
 </file>
 
 <file path=word/styles.xml><?xml version="1.0" encoding="utf-8"?>
-<w:styles xmlns:mc="http://schemas.openxmlformats.org/markup-compatibility/2006" xmlns:r="http://schemas.openxmlformats.org/officeDocument/2006/relationships" xmlns:w="http://schemas.openxmlformats.org/wordprocessingml/2006/main" xmlns:w14="http://schemas.microsoft.com/office/word/2010/wordml" xmlns:w15="http://schemas.microsoft.com/office/word/2012/wordml" xmlns:w16cex="http://schemas.microsoft.com/office/word/2018/wordml/cex" xmlns:w16cid="http://schemas.microsoft.com/office/word/2016/wordml/cid" xmlns:w16="http://schemas.microsoft.com/office/word/2018/wordml" xmlns:w16sdtdh="http://schemas.microsoft.com/office/word/2020/wordml/sdtdatahash" xmlns:w16se="http://schemas.microsoft.com/office/word/2015/wordml/symex" mc:Ignorable="w14 w15 w16se w16cid w16 w16cex w16sdtdh">
+<w:styles xmlns:mc="http://schemas.openxmlformats.org/markup-compatibility/2006" xmlns:r="http://schemas.openxmlformats.org/officeDocument/2006/relationships" xmlns:w="http://schemas.openxmlformats.org/wordprocessingml/2006/main" xmlns:w14="http://schemas.microsoft.com/office/word/2010/wordml" xmlns:w15="http://schemas.microsoft.com/office/word/2012/wordml" xmlns:w16cex="http://schemas.microsoft.com/office/word/2018/wordml/cex" xmlns:w16cid="http://schemas.microsoft.com/office/word/2016/wordml/cid" xmlns:w16="http://schemas.microsoft.com/office/word/2018/wordml" xmlns:w16du="http://schemas.microsoft.com/office/word/2023/wordml/word16du" xmlns:w16sdtdh="http://schemas.microsoft.com/office/word/2020/wordml/sdtdatahash" xmlns:w16sdtfl="http://schemas.microsoft.com/office/word/2024/wordml/sdtformatlock" xmlns:w16se="http://schemas.microsoft.com/office/word/2015/wordml/symex" mc:Ignorable="w14 w15 w16se w16cid w16 w16cex w16sdtdh w16sdtfl w16du">
   <w:docDefaults>
     <w:rPrDefault>
       <w:rPr>
@@ -2735,7 +2908,6 @@
   <w:style w:type="character" w:default="1" w:styleId="Policepardfaut">
     <w:name w:val="Default Paragraph Font"/>
     <w:uiPriority w:val="1"/>
-    <w:semiHidden/>
     <w:unhideWhenUsed/>
   </w:style>
   <w:style w:type="table" w:default="1" w:styleId="TableauNormal">

</xml_diff>